<commit_message>
El retiro del 25 de octubre pasa a llamarse «Una pausa para volver a ti»
Carteles, imágenes de WhatsApp y del enlace, página del retiro, portada y
documentos del retiro 1. PDF, PNG, JPG y docx regenerados.

Co-Authored-By: Claude Opus 5.5 <noreply@anthropic.com>
</commit_message>
<xml_diff>
--- a/retiros/retiro-1-volver-a-ti.docx
+++ b/retiros/retiro-1-volver-a-ti.docx
@@ -14,7 +14,7 @@
           <w:b/>
           <w:spacing w:val="0"/>
         </w:rPr>
-        <w:t xml:space="preserve">Maternal Mind · Retiro 1 · Volver a ti</w:t>
+        <w:t xml:space="preserve">Maternal Mind · Retiro 1 · Una pausa para volver a ti</w:t>
       </w:r>
     </w:p>
     <w:p>
@@ -5626,7 +5626,7 @@
           <w:sz-cs w:val="29"/>
           <w:spacing w:val="0"/>
         </w:rPr>
-        <w:t xml:space="preserve">Maternal Mind · Volver a ti Respiración, modo ser, sabiduría interna e intuición </w:t>
+        <w:t xml:space="preserve">Maternal Mind · Una pausa para volver a ti Respiración, modo ser, sabiduría interna e intuición </w:t>
       </w:r>
       <w:r>
         <w:rPr>

</xml_diff>